<commit_message>
Design doc v8: split −3dB derivation into steps; resolve "what noise?" comment
- 3-1 formula: separate the N=2 substitution from the dB conversion, now four
  explicit lines: φ̄=Σφᵢ/N ; S_φ̄=ΣS/N²=S_φ/N ; N=2 ⇒ S_φ̄=S_φ/2 ;
  10·log₁₀(½)≈−3 dB. Updated the caption to match.
- Address the user's Word comment ("これはなんの雑音？" anchored to 雑音を持ち込まず):
  06 keymsg/body now say 近傍位相雑音（同期動作に伴う短期の位相ゆらぎ）, consistent
  with 4-5/05. Removed the comment markers + comment parts (resolved).

Co-Authored-By: Claude Opus 4.8 <noreply@anthropic.com>
</commit_message>
<xml_diff>
--- a/presentations/mid_term_202606/04_slides_draft/中間発表_スライド設計書_v8.docx
+++ b/presentations/mid_term_202606/04_slides_draft/中間発表_スライド設計書_v8.docx
@@ -949,7 +949,7 @@
       <w:r>
         <w:drawing>
           <wp:inline xmlns:a="http://schemas.openxmlformats.org/drawingml/2006/main" xmlns:pic="http://schemas.openxmlformats.org/drawingml/2006/picture">
-            <wp:extent cx="4754880" cy="1302244"/>
+            <wp:extent cx="4754880" cy="4179177"/>
             <wp:docPr id="1910953332" name="Picture 1910953332"/>
             <wp:cNvGraphicFramePr>
               <a:graphicFrameLocks noChangeAspect="1"/>
@@ -962,7 +962,7 @@
                     <pic:cNvPicPr/>
                   </pic:nvPicPr>
                   <pic:blipFill>
-                    <a:blip r:embed="rId22"/>
+                    <a:blip r:embed="rId15"/>
                     <a:stretch>
                       <a:fillRect/>
                     </a:stretch>
@@ -970,7 +970,7 @@
                   <pic:spPr>
                     <a:xfrm>
                       <a:off x="0" y="0"/>
-                      <a:ext cx="4754880" cy="1302244"/>
+                      <a:ext cx="4754880" cy="4179177"/>
                     </a:xfrm>
                     <a:prstGeom prst="rect"/>
                   </pic:spPr>
@@ -991,7 +991,7 @@
           <w:color w:val="595959"/>
           <w:sz w:val="17"/>
         </w:rPr>
-        <w:t>無相関雑音の平均：N台で電力 1/N（2台で −3 dB）</w:t>
+        <w:t>無相関雑音をN台平均すると雑音パワーは 1/N。N=2 を代入して S_φ/2、dB換算で 10·log₁₀(1/2)≈−3 dB</w:t>
       </w:r>
     </w:p>
     <w:p>
@@ -2424,120 +2424,17 @@
       </w:pPr>
       <w:r>
         <w:rPr>
+          <w:rFonts w:eastAsia="游ゴシック" w:ascii="游ゴシック" w:hAnsi="游ゴシック"/>
           <w:b/>
           <w:color w:val="B03010"/>
-          <w:lang w:eastAsia="ja-JP"/>
-        </w:rPr>
-        <w:lastRenderedPageBreak/>
+        </w:rPr>
         <w:t>キーメッセージ：</w:t>
       </w:r>
       <w:r>
         <w:rPr>
-          <w:rFonts w:hint="eastAsia"/>
-          <w:lang w:eastAsia="ja-JP"/>
-        </w:rPr>
-        <w:t>フィードバック</w:t>
-      </w:r>
-      <w:r>
-        <w:rPr>
-          <w:lang w:eastAsia="ja-JP"/>
-        </w:rPr>
-        <w:t>制御</w:t>
-      </w:r>
-      <w:r>
-        <w:rPr>
-          <w:rFonts w:hint="eastAsia"/>
-          <w:lang w:eastAsia="ja-JP"/>
-        </w:rPr>
-        <w:t>により、</w:t>
-      </w:r>
-      <w:commentRangeStart w:id="0"/>
-      <w:r>
-        <w:rPr>
-          <w:lang w:eastAsia="ja-JP"/>
-        </w:rPr>
-        <w:t>雑音を持ち込まず</w:t>
-      </w:r>
-      <w:commentRangeEnd w:id="0"/>
-      <w:r>
-        <w:rPr>
-          <w:rStyle w:val="aff"/>
-          <w:sz w:val="21"/>
-          <w:szCs w:val="22"/>
-          <w:lang w:eastAsia="ja-JP"/>
-        </w:rPr>
-        <w:commentReference w:id="0"/>
-      </w:r>
-      <w:r>
-        <w:rPr>
-          <w:lang w:eastAsia="ja-JP"/>
-        </w:rPr>
-        <w:t>に同期</w:t>
-      </w:r>
-      <w:r>
-        <w:rPr>
-          <w:rFonts w:hint="eastAsia"/>
-          <w:lang w:eastAsia="ja-JP"/>
-        </w:rPr>
-        <w:t>させることに成功した</w:t>
-      </w:r>
-      <w:r>
-        <w:rPr>
-          <w:lang w:eastAsia="ja-JP"/>
-        </w:rPr>
-        <w:t>。今後は</w:t>
-      </w:r>
-      <w:r>
-        <w:rPr>
-          <w:rFonts w:hint="eastAsia"/>
-          <w:lang w:eastAsia="ja-JP"/>
-        </w:rPr>
-        <w:t>二つのOCXOを同時に制御し</w:t>
-      </w:r>
-      <w:r>
-        <w:rPr>
-          <w:lang w:eastAsia="ja-JP"/>
-        </w:rPr>
-        <w:t>合成器で2台を平均</w:t>
-      </w:r>
-      <w:r>
-        <w:rPr>
-          <w:rFonts w:hint="eastAsia"/>
-          <w:lang w:eastAsia="ja-JP"/>
-        </w:rPr>
-        <w:t>することで、-</w:t>
-      </w:r>
-      <w:r>
-        <w:rPr>
-          <w:lang w:eastAsia="ja-JP"/>
-        </w:rPr>
-        <w:t>3 dB</w:t>
-      </w:r>
-      <w:r>
-        <w:rPr>
-          <w:rFonts w:hint="eastAsia"/>
-          <w:lang w:eastAsia="ja-JP"/>
-        </w:rPr>
-        <w:t>の精度向上</w:t>
-      </w:r>
-      <w:r>
-        <w:rPr>
-          <w:lang w:eastAsia="ja-JP"/>
-        </w:rPr>
-        <w:t>を実証し、N台へ</w:t>
-      </w:r>
-      <w:r>
-        <w:rPr>
-          <w:rFonts w:hint="eastAsia"/>
-          <w:lang w:eastAsia="ja-JP"/>
-        </w:rPr>
-        <w:t>拡張</w:t>
-      </w:r>
-      <w:r>
-        <w:rPr>
-          <w:lang w:eastAsia="ja-JP"/>
-        </w:rPr>
-        <w:t>させる。</w:t>
+          <w:rFonts w:eastAsia="游ゴシック" w:ascii="游ゴシック" w:hAnsi="游ゴシック"/>
+        </w:rPr>
+        <w:t>フィードバック制御により、近傍位相雑音（同期動作に伴う短期の位相ゆらぎ）を持ち込まずに同期させることに成功した。今後は二つのOCXOを同時に制御し、合成器で2台を平均して −3 dB の精度向上を実証し、N台へ拡張する。</w:t>
       </w:r>
     </w:p>
     <w:p>
@@ -2566,33 +2463,10 @@
       </w:pPr>
       <w:r>
         <w:rPr>
+          <w:rFonts w:eastAsia="游ゴシック" w:ascii="游ゴシック" w:hAnsi="游ゴシック"/>
           <w:sz w:val="20"/>
-          <w:lang w:eastAsia="ja-JP"/>
-        </w:rPr>
-        <w:t>・</w:t>
-      </w:r>
-      <w:r>
-        <w:rPr>
-          <w:rFonts w:hint="eastAsia"/>
-          <w:sz w:val="20"/>
-          <w:lang w:eastAsia="ja-JP"/>
-        </w:rPr>
-        <w:t>現状</w:t>
-      </w:r>
-      <w:r>
-        <w:rPr>
-          <w:sz w:val="20"/>
-          <w:lang w:eastAsia="ja-JP"/>
-        </w:rPr>
-        <w:t>：実測モデルに基づくFBで雑音を注入せず同期</w:t>
-      </w:r>
-      <w:r>
-        <w:rPr>
-          <w:rFonts w:hint="eastAsia"/>
-          <w:sz w:val="20"/>
-          <w:lang w:eastAsia="ja-JP"/>
-        </w:rPr>
-        <w:t>を実現</w:t>
+        </w:rPr>
+        <w:t>・現状：実測モデルに基づくFBで近傍位相雑音を注入せず同期を実現</w:t>
       </w:r>
     </w:p>
     <w:p>
@@ -2778,45 +2652,6 @@
     </w:sectPr>
   </w:body>
 </w:document>
-</file>
-
-<file path=word/comments.xml><?xml version="1.0" encoding="utf-8"?>
-<w:comments xmlns:wpc="http://schemas.microsoft.com/office/word/2010/wordprocessingCanvas" xmlns:cx="http://schemas.microsoft.com/office/drawing/2014/chartex" xmlns:cx1="http://schemas.microsoft.com/office/drawing/2015/9/8/chartex" xmlns:cx2="http://schemas.microsoft.com/office/drawing/2015/10/21/chartex" xmlns:cx3="http://schemas.microsoft.com/office/drawing/2016/5/9/chartex" xmlns:cx4="http://schemas.microsoft.com/office/drawing/2016/5/10/chartex" xmlns:cx5="http://schemas.microsoft.com/office/drawing/2016/5/11/chartex" xmlns:cx6="http://schemas.microsoft.com/office/drawing/2016/5/12/chartex" xmlns:cx7="http://schemas.microsoft.com/office/drawing/2016/5/13/chartex" xmlns:cx8="http://schemas.microsoft.com/office/drawing/2016/5/14/chartex" xmlns:mc="http://schemas.openxmlformats.org/markup-compatibility/2006" xmlns:aink="http://schemas.microsoft.com/office/drawing/2016/ink" xmlns:am3d="http://schemas.microsoft.com/office/drawing/2017/model3d" xmlns:o="urn:schemas-microsoft-com:office:office" xmlns:oel="http://schemas.microsoft.com/office/2019/extlst" xmlns:r="http://schemas.openxmlformats.org/officeDocument/2006/relationships" xmlns:m="http://schemas.openxmlformats.org/officeDocument/2006/math" xmlns:v="urn:schemas-microsoft-com:vml" xmlns:wp14="http://schemas.microsoft.com/office/word/2010/wordprocessingDrawing" xmlns:wp="http://schemas.openxmlformats.org/drawingml/2006/wordprocessingDrawing" xmlns:w10="urn:schemas-microsoft-com:office:word" xmlns:w="http://schemas.openxmlformats.org/wordprocessingml/2006/main" xmlns:w14="http://schemas.microsoft.com/office/word/2010/wordml" xmlns:w15="http://schemas.microsoft.com/office/word/2012/wordml" xmlns:w16cex="http://schemas.microsoft.com/office/word/2018/wordml/cex" xmlns:w16cid="http://schemas.microsoft.com/office/word/2016/wordml/cid" xmlns:w16="http://schemas.microsoft.com/office/word/2018/wordml" xmlns:w16du="http://schemas.microsoft.com/office/word/2023/wordml/word16du" xmlns:w16sdtdh="http://schemas.microsoft.com/office/word/2020/wordml/sdtdatahash" xmlns:w16sdtfl="http://schemas.microsoft.com/office/word/2024/wordml/sdtformatlock" xmlns:w16se="http://schemas.microsoft.com/office/word/2015/wordml/symex" xmlns:wpg="http://schemas.microsoft.com/office/word/2010/wordprocessingGroup" xmlns:wpi="http://schemas.microsoft.com/office/word/2010/wordprocessingInk" xmlns:wne="http://schemas.microsoft.com/office/word/2006/wordml" xmlns:wps="http://schemas.microsoft.com/office/word/2010/wordprocessingShape" mc:Ignorable="w14 w15 w16se w16cid w16 w16cex w16sdtdh w16sdtfl w16du wp14">
-  <w:comment w:id="0" w:author="福井　晴士郎" w:date="2026-06-23T19:16:00Z" w:initials="晴福">
-    <w:p>
-      <w:pPr>
-        <w:pStyle w:val="aff0"/>
-      </w:pPr>
-      <w:r>
-        <w:rPr>
-          <w:rStyle w:val="aff"/>
-        </w:rPr>
-        <w:annotationRef/>
-      </w:r>
-      <w:r>
-        <w:t>これはなんの雑音？</w:t>
-      </w:r>
-    </w:p>
-  </w:comment>
-</w:comments>
-</file>
-
-<file path=word/commentsExtended.xml><?xml version="1.0" encoding="utf-8"?>
-<w15:commentsEx xmlns:wpc="http://schemas.microsoft.com/office/word/2010/wordprocessingCanvas" xmlns:cx="http://schemas.microsoft.com/office/drawing/2014/chartex" xmlns:cx1="http://schemas.microsoft.com/office/drawing/2015/9/8/chartex" xmlns:cx2="http://schemas.microsoft.com/office/drawing/2015/10/21/chartex" xmlns:cx3="http://schemas.microsoft.com/office/drawing/2016/5/9/chartex" xmlns:cx4="http://schemas.microsoft.com/office/drawing/2016/5/10/chartex" xmlns:cx5="http://schemas.microsoft.com/office/drawing/2016/5/11/chartex" xmlns:cx6="http://schemas.microsoft.com/office/drawing/2016/5/12/chartex" xmlns:cx7="http://schemas.microsoft.com/office/drawing/2016/5/13/chartex" xmlns:cx8="http://schemas.microsoft.com/office/drawing/2016/5/14/chartex" xmlns:mc="http://schemas.openxmlformats.org/markup-compatibility/2006" xmlns:aink="http://schemas.microsoft.com/office/drawing/2016/ink" xmlns:am3d="http://schemas.microsoft.com/office/drawing/2017/model3d" xmlns:o="urn:schemas-microsoft-com:office:office" xmlns:oel="http://schemas.microsoft.com/office/2019/extlst" xmlns:r="http://schemas.openxmlformats.org/officeDocument/2006/relationships" xmlns:m="http://schemas.openxmlformats.org/officeDocument/2006/math" xmlns:v="urn:schemas-microsoft-com:vml" xmlns:wp14="http://schemas.microsoft.com/office/word/2010/wordprocessingDrawing" xmlns:wp="http://schemas.openxmlformats.org/drawingml/2006/wordprocessingDrawing" xmlns:w10="urn:schemas-microsoft-com:office:word" xmlns:w="http://schemas.openxmlformats.org/wordprocessingml/2006/main" xmlns:w14="http://schemas.microsoft.com/office/word/2010/wordml" xmlns:w15="http://schemas.microsoft.com/office/word/2012/wordml" xmlns:w16cex="http://schemas.microsoft.com/office/word/2018/wordml/cex" xmlns:w16cid="http://schemas.microsoft.com/office/word/2016/wordml/cid" xmlns:w16="http://schemas.microsoft.com/office/word/2018/wordml" xmlns:w16du="http://schemas.microsoft.com/office/word/2023/wordml/word16du" xmlns:w16sdtdh="http://schemas.microsoft.com/office/word/2020/wordml/sdtdatahash" xmlns:w16sdtfl="http://schemas.microsoft.com/office/word/2024/wordml/sdtformatlock" xmlns:w16se="http://schemas.microsoft.com/office/word/2015/wordml/symex" xmlns:wpg="http://schemas.microsoft.com/office/word/2010/wordprocessingGroup" xmlns:wpi="http://schemas.microsoft.com/office/word/2010/wordprocessingInk" xmlns:wne="http://schemas.microsoft.com/office/word/2006/wordml" xmlns:wps="http://schemas.microsoft.com/office/word/2010/wordprocessingShape" mc:Ignorable="w14 w15 w16se w16cid w16 w16cex w16sdtdh w16sdtfl w16du wp14">
-  <w15:commentEx w15:paraId="2398547C" w15:done="0"/>
-</w15:commentsEx>
-</file>
-
-<file path=word/commentsExtensible.xml><?xml version="1.0" encoding="utf-8"?>
-<w16cex:commentsExtensible xmlns:wpc="http://schemas.microsoft.com/office/word/2010/wordprocessingCanvas" xmlns:cx="http://schemas.microsoft.com/office/drawing/2014/chartex" xmlns:cx1="http://schemas.microsoft.com/office/drawing/2015/9/8/chartex" xmlns:cx2="http://schemas.microsoft.com/office/drawing/2015/10/21/chartex" xmlns:cx3="http://schemas.microsoft.com/office/drawing/2016/5/9/chartex" xmlns:cx4="http://schemas.microsoft.com/office/drawing/2016/5/10/chartex" xmlns:cx5="http://schemas.microsoft.com/office/drawing/2016/5/11/chartex" xmlns:cx6="http://schemas.microsoft.com/office/drawing/2016/5/12/chartex" xmlns:cx7="http://schemas.microsoft.com/office/drawing/2016/5/13/chartex" xmlns:cx8="http://schemas.microsoft.com/office/drawing/2016/5/14/chartex" xmlns:cr="http://schemas.microsoft.com/office/comments/2020/reactions" xmlns:mc="http://schemas.openxmlformats.org/markup-compatibility/2006" xmlns:aink="http://schemas.microsoft.com/office/drawing/2016/ink" xmlns:am3d="http://schemas.microsoft.com/office/drawing/2017/model3d" xmlns:o="urn:schemas-microsoft-com:office:office" xmlns:oel="http://schemas.microsoft.com/office/2019/extlst" xmlns:r="http://schemas.openxmlformats.org/officeDocument/2006/relationships" xmlns:m="http://schemas.openxmlformats.org/officeDocument/2006/math" xmlns:v="urn:schemas-microsoft-com:vml" xmlns:wp14="http://schemas.microsoft.com/office/word/2010/wordprocessingDrawing" xmlns:wp="http://schemas.openxmlformats.org/drawingml/2006/wordprocessingDrawing" xmlns:w10="urn:schemas-microsoft-com:office:word" xmlns:w="http://schemas.openxmlformats.org/wordprocessingml/2006/main" xmlns:w14="http://schemas.microsoft.com/office/word/2010/wordml" xmlns:w15="http://schemas.microsoft.com/office/word/2012/wordml" xmlns:w16cex="http://schemas.microsoft.com/office/word/2018/wordml/cex" xmlns:w16cid="http://schemas.microsoft.com/office/word/2016/wordml/cid" xmlns:w16="http://schemas.microsoft.com/office/word/2018/wordml" xmlns:w16du="http://schemas.microsoft.com/office/word/2023/wordml/word16du" xmlns:w16sdtdh="http://schemas.microsoft.com/office/word/2020/wordml/sdtdatahash" xmlns:w16sdtfl="http://schemas.microsoft.com/office/word/2024/wordml/sdtformatlock" xmlns:w16se="http://schemas.microsoft.com/office/word/2015/wordml/symex" xmlns:wpg="http://schemas.microsoft.com/office/word/2010/wordprocessingGroup" xmlns:wpi="http://schemas.microsoft.com/office/word/2010/wordprocessingInk" xmlns:wne="http://schemas.microsoft.com/office/word/2006/wordml" xmlns:wps="http://schemas.microsoft.com/office/word/2010/wordprocessingShape" mc:Ignorable="w14 w15 w16se w16cid w16 w16cex w16sdtdh w16sdtfl cr w16du wp14">
-  <w16cex:commentExtensible w16cex:durableId="072D91FF" w16cex:dateUtc="2026-06-23T10:16:00Z"/>
-</w16cex:commentsExtensible>
-</file>
-
-<file path=word/commentsIds.xml><?xml version="1.0" encoding="utf-8"?>
-<w16cid:commentsIds xmlns:wpc="http://schemas.microsoft.com/office/word/2010/wordprocessingCanvas" xmlns:cx="http://schemas.microsoft.com/office/drawing/2014/chartex" xmlns:cx1="http://schemas.microsoft.com/office/drawing/2015/9/8/chartex" xmlns:cx2="http://schemas.microsoft.com/office/drawing/2015/10/21/chartex" xmlns:cx3="http://schemas.microsoft.com/office/drawing/2016/5/9/chartex" xmlns:cx4="http://schemas.microsoft.com/office/drawing/2016/5/10/chartex" xmlns:cx5="http://schemas.microsoft.com/office/drawing/2016/5/11/chartex" xmlns:cx6="http://schemas.microsoft.com/office/drawing/2016/5/12/chartex" xmlns:cx7="http://schemas.microsoft.com/office/drawing/2016/5/13/chartex" xmlns:cx8="http://schemas.microsoft.com/office/drawing/2016/5/14/chartex" xmlns:mc="http://schemas.openxmlformats.org/markup-compatibility/2006" xmlns:aink="http://schemas.microsoft.com/office/drawing/2016/ink" xmlns:am3d="http://schemas.microsoft.com/office/drawing/2017/model3d" xmlns:o="urn:schemas-microsoft-com:office:office" xmlns:oel="http://schemas.microsoft.com/office/2019/extlst" xmlns:r="http://schemas.openxmlformats.org/officeDocument/2006/relationships" xmlns:m="http://schemas.openxmlformats.org/officeDocument/2006/math" xmlns:v="urn:schemas-microsoft-com:vml" xmlns:wp14="http://schemas.microsoft.com/office/word/2010/wordprocessingDrawing" xmlns:wp="http://schemas.openxmlformats.org/drawingml/2006/wordprocessingDrawing" xmlns:w10="urn:schemas-microsoft-com:office:word" xmlns:w="http://schemas.openxmlformats.org/wordprocessingml/2006/main" xmlns:w14="http://schemas.microsoft.com/office/word/2010/wordml" xmlns:w15="http://schemas.microsoft.com/office/word/2012/wordml" xmlns:w16cex="http://schemas.microsoft.com/office/word/2018/wordml/cex" xmlns:w16cid="http://schemas.microsoft.com/office/word/2016/wordml/cid" xmlns:w16="http://schemas.microsoft.com/office/word/2018/wordml" xmlns:w16du="http://schemas.microsoft.com/office/word/2023/wordml/word16du" xmlns:w16sdtdh="http://schemas.microsoft.com/office/word/2020/wordml/sdtdatahash" xmlns:w16sdtfl="http://schemas.microsoft.com/office/word/2024/wordml/sdtformatlock" xmlns:w16se="http://schemas.microsoft.com/office/word/2015/wordml/symex" xmlns:wpg="http://schemas.microsoft.com/office/word/2010/wordprocessingGroup" xmlns:wpi="http://schemas.microsoft.com/office/word/2010/wordprocessingInk" xmlns:wne="http://schemas.microsoft.com/office/word/2006/wordml" xmlns:wps="http://schemas.microsoft.com/office/word/2010/wordprocessingShape" mc:Ignorable="w14 w15 w16se w16cid w16 w16cex w16sdtdh w16sdtfl w16du wp14">
-  <w16cid:commentId w16cid:paraId="2398547C" w16cid:durableId="072D91FF"/>
-</w16cid:commentsIds>
 </file>
 
 <file path=word/numbering.xml><?xml version="1.0" encoding="utf-8"?>

</xml_diff>